<commit_message>
Movement 7: Chapters 21-23 drafted (B5 Learn the Food Chain begins), pending approval
Weekly run, 2026-10-27. Ten chapters (11-20) await review, so three were
written. Chapter 21 "The Second List", 22 "No Sun", 23 "Covered":
the B4 aftermath (Mercer, boiling the twelve liters, Mark's trough list),
a sunless morning on the cameras (the spider waits for warmth, not sun;
it crosses the asphalt to the cart), and Paul's trough proved in the yard,
with one test set for first gray on March 10.

All three are review_status: in-review, audio_status: not-started. No
approval state changed; no audio generated. 45 speaker pins; validation
for Chapters 1-23 READY. Reader manifest rebuilt; 19-21 Word file now
complete, 22-24 started. Handoff: reviews/movement-07/handoff.md.

Co-Authored-By: Claude Opus 5.5 <noreply@anthropic.com>
Claude-Session: https://claude.ai/code/session_0131aNiZD9M5bN9pqxT8JEFj
</commit_message>
<xml_diff>
--- a/manuscripts/19-21 Chapters - TRADDOMIUM Micro Battle.docx
+++ b/manuscripts/19-21 Chapters - TRADDOMIUM Micro Battle.docx
@@ -919,6 +919,409 @@
     <w:p>
       <w:r>
         <w:t>Mark didn't say yes. He didn't say no, either. He looked up at the station's high window, where the last of the drops on the grass were already shrinking in the sun, and Jack could see him starting a new list.</w:t>
+      </w:r>
+    </w:p>
+    <w:p>
+      <w:pPr>
+        <w:pStyle w:val="Heading1"/>
+      </w:pPr>
+      <w:r>
+        <w:t>Chapter 21: The Second List</w:t>
+      </w:r>
+    </w:p>
+    <w:p>
+      <w:r>
+        <w:t>Doctor Mercer came through the station door at five past eight with her bag in one hand and her coat still unbuttoned. She looked at the jug on the floor, then at Aiden in his blankets, then at Jack.</w:t>
+      </w:r>
+    </w:p>
+    <w:p>
+      <w:r>
+        <w:t>"Hand."</w:t>
+      </w:r>
+    </w:p>
+    <w:p>
+      <w:r>
+        <w:t>Jack held it out. She unwound the towel, peeled back the wet tape, and turned the back of his hand toward the window light. The four stitches were still there. Around them, the skin had gone soft and white from the water, and the edges of the cut were a little pink.</w:t>
+      </w:r>
+    </w:p>
+    <w:p>
+      <w:r>
+        <w:t>She tilted it toward the light. "They held."</w:t>
+      </w:r>
+    </w:p>
+    <w:p>
+      <w:r>
+        <w:t>"Is that good?"</w:t>
+      </w:r>
+    </w:p>
+    <w:p>
+      <w:r>
+        <w:t>"It's not bad. Sit still."</w:t>
+      </w:r>
+    </w:p>
+    <w:p>
+      <w:r>
+        <w:t>She cleaned it with something cold that stung all the way up to his elbow. Jack sat still. Across the room, Aiden watched with the expression of a man who was very glad it wasn't his hand.</w:t>
+      </w:r>
+    </w:p>
+    <w:p>
+      <w:r>
+        <w:t>Doctor Mercer taped a fresh dressing over the stitches and pressed the edges down with her thumb, one side at a time. "If it goes red and hot, or it starts to throb at night, I want to see it the same hour. Not the next morning. I have antibiotics. I would very much like to never open them. I can't make more."</w:t>
+      </w:r>
+    </w:p>
+    <w:p>
+      <w:r>
+        <w:t>"Yes, Doctor."</w:t>
+      </w:r>
+    </w:p>
+    <w:p>
+      <w:r>
+        <w:t>"You said that last time."</w:t>
+      </w:r>
+    </w:p>
+    <w:p>
+      <w:r>
+        <w:t>She turned to Aiden, took his hands, and looked at his fingers one by one. She pressed a fingernail and watched the color come back.</w:t>
+      </w:r>
+    </w:p>
+    <w:p>
+      <w:r>
+        <w:t>"You're warm. Did you hit your head when you went down?"</w:t>
+      </w:r>
+    </w:p>
+    <w:p>
+      <w:r>
+        <w:t>"No. I hit the water. The water hit me."</w:t>
+      </w:r>
+    </w:p>
+    <w:p>
+      <w:r>
+        <w:t>"Then you're going home. Dry clothes, something hot, and four hours of sleep."</w:t>
+      </w:r>
+    </w:p>
+    <w:p>
+      <w:r>
+        <w:t>Aiden held up the vial. "I have to start the long test."</w:t>
+      </w:r>
+    </w:p>
+    <w:p>
+      <w:r>
+        <w:t>"Start it. Then sleep."</w:t>
+      </w:r>
+    </w:p>
+    <w:p>
+      <w:r>
+        <w:t>She closed her bag, and for a second she didn't move. She stood with one hand flat on top of it, and Jack saw how tired she was, more tired than any of them. Then she buttoned her coat.</w:t>
+      </w:r>
+    </w:p>
+    <w:p>
+      <w:r>
+        <w:t>"Eight o'clock tonight. Both of you. Jack, that means your wife and your hand."</w:t>
+      </w:r>
+    </w:p>
+    <w:p>
+      <w:r>
+        <w:t>When the door had shut behind her, Lena dragged a camp stove out from under the gauge desk and set a steel pot on it. She poured the twelve liters through a filter cloth, a little at a time, and lit the burner.</w:t>
+      </w:r>
+    </w:p>
+    <w:p>
+      <w:r>
+        <w:t>Nobody said anything while it heated. When it finally boiled, Lena let it roll for a full minute by her watch, then turned the flame off and ladled some into a mug.</w:t>
+      </w:r>
+    </w:p>
+    <w:p>
+      <w:r>
+        <w:t>Aiden reached for it before anyone else could. He held it in both hands for a while, letting it cool. Jack saw his fingers shake once, and it wasn't the cold anymore.</w:t>
+      </w:r>
+    </w:p>
+    <w:p>
+      <w:r>
+        <w:t>Then he drank.</w:t>
+      </w:r>
+    </w:p>
+    <w:p>
+      <w:r>
+        <w:t>"Flat. It tastes like nothing."</w:t>
+      </w:r>
+    </w:p>
+    <w:p>
+      <w:r>
+        <w:t>Lena took the mug back and looked into it. "That's what water tastes like."</w:t>
+      </w:r>
+    </w:p>
+    <w:p>
+      <w:r>
+        <w:t>"I know. I just thought it would taste like something, after all that."</w:t>
+      </w:r>
+    </w:p>
+    <w:p>
+      <w:r>
+        <w:t>Mark had found his whiteboard again. He had wiped off yesterday's words, all but Be boring in the corner, and at the top he had written a new one. Trough.</w:t>
+      </w:r>
+    </w:p>
+    <w:p>
+      <w:r>
+        <w:t>He uncapped the marker. "Jack's trough. Five things I don't like about it."</w:t>
+      </w:r>
+    </w:p>
+    <w:p>
+      <w:r>
+        <w:t>He wrote as he talked.</w:t>
+      </w:r>
+    </w:p>
+    <w:p>
+      <w:r>
+        <w:t>"Shaking a blade is fast. Fast is food. Aiden's rule, not mine."</w:t>
+      </w:r>
+    </w:p>
+    <w:p>
+      <w:r>
+        <w:t>He tapped the board under the second line. "A drop that size doesn't fall, it lands. We all saw what it did to Aiden. Now picture it landing on a trough, with somebody standing beside it."</w:t>
+      </w:r>
+    </w:p>
+    <w:p>
+      <w:r>
+        <w:t>Under that he wrote: Right under the retreat.</w:t>
+      </w:r>
+    </w:p>
+    <w:p>
+      <w:r>
+        <w:t>"Of all the leaves at the end of that road, the ones with the biggest drops are the ones under its front door. And whoever's shaking that blade stands at the edge longer than anybody else. Longer than we did today."</w:t>
+      </w:r>
+    </w:p>
+    <w:p>
+      <w:r>
+        <w:t>Jack studied the board. "And the fifth?"</w:t>
+      </w:r>
+    </w:p>
+    <w:p>
+      <w:r>
+        <w:t>Mark capped the marker and turned around. "We don't know what it does on a morning that isn't like this one."</w:t>
+      </w:r>
+    </w:p>
+    <w:p>
+      <w:r>
+        <w:t>Lena's console chimed. Sarah's voice came out of the speaker, a little hoarse. "You know three. Not one."</w:t>
+      </w:r>
+    </w:p>
+    <w:p>
+      <w:r>
+        <w:t>Mark looked at the speaker as though it had interrupted him in a meeting, which it had. "Go on, Doctor Bennett."</w:t>
+      </w:r>
+    </w:p>
+    <w:p>
+      <w:r>
+        <w:t>"March sixth. The morning Aiden called. It was already out at dawn, before the sun was on it, sitting in the grass right in front of the greenhouse glass. Out in the open, waiting. The next two mornings, it stayed in its retreat until the sun found it."</w:t>
+      </w:r>
+    </w:p>
+    <w:p>
+      <w:r>
+        <w:t>Aiden sat up inside his blankets. "The grow lights were on all night, that first night. The glass would have been warm. And full of flies."</w:t>
+      </w:r>
+    </w:p>
+    <w:p>
+      <w:r>
+        <w:t>Mark wrote it down at the bottom of the board, smaller. Warm glass. Out early.</w:t>
+      </w:r>
+    </w:p>
+    <w:p>
+      <w:r>
+        <w:t>Jack frowned at the board. "So it doesn't keep a clock."</w:t>
+      </w:r>
+    </w:p>
+    <w:p>
+      <w:r>
+        <w:t>Over the speaker, a page turned. "Not one we understand yet. Which is your fifth point, Mark. I agree with it."</w:t>
+      </w:r>
+    </w:p>
+    <w:p>
+      <w:r>
+        <w:t>Mark looked at the board for a long while. Jack watched him do what he always did, adding it up from the bottom.</w:t>
+      </w:r>
+    </w:p>
+    <w:p>
+      <w:r>
+        <w:t>"Then here's what we do. Nobody goes back to the end of that road until we've watched it do this a few more mornings. Watched, not visited. From the cameras."</w:t>
+      </w:r>
+    </w:p>
+    <w:p>
+      <w:r>
+        <w:t>Lena already had her pen on her notepad. "Every morning we wait is another fifteen thousand liters out of the tanks."</w:t>
+      </w:r>
+    </w:p>
+    <w:p>
+      <w:r>
+        <w:t>Mark didn't turn from the board. "I know what it costs."</w:t>
+      </w:r>
+    </w:p>
+    <w:p>
+      <w:r>
+        <w:t>"I'm only saying it out loud, so it's on the board."</w:t>
+      </w:r>
+    </w:p>
+    <w:p>
+      <w:r>
+        <w:t>Mark wrote it on the board anyway. Fifteen thousand a day. Then he looked at the speaker. "Somebody has to watch every minute of every morning, and write it down. When it comes out. Where it goes. What it eats."</w:t>
+      </w:r>
+    </w:p>
+    <w:p>
+      <w:r>
+        <w:t>Sarah's voice came back so fast it was almost a laugh. "I've been lying on this couch for two days with nothing to do but look at those cameras. Give me a notebook."</w:t>
+      </w:r>
+    </w:p>
+    <w:p>
+      <w:r>
+        <w:t>Jack opened his mouth. Sarah got there first.</w:t>
+      </w:r>
+    </w:p>
+    <w:p>
+      <w:r>
+        <w:t>"Doctor Mercer said rest. She didn't say blind. Ask her."</w:t>
+      </w:r>
+    </w:p>
+    <w:p>
+      <w:r>
+        <w:t>He asked her, by message, while the others argued about where to point the second camera. The answer came back in under a minute. Watching is fine. Running things is not. Tell her I said that, in those words.</w:t>
+      </w:r>
+    </w:p>
+    <w:p>
+      <w:r>
+        <w:t>He read it out. On the speaker, Sarah sighed. "She knows me."</w:t>
+      </w:r>
+    </w:p>
+    <w:p>
+      <w:r>
+        <w:t>Mark turned back to the board one last time. "And one more thing, so nobody gets them mixed up. Whatever's been hitting the ground at night, out past the cameras, isn't on this list. That's a different question."</w:t>
+      </w:r>
+    </w:p>
+    <w:p>
+      <w:r>
+        <w:t>By noon, Jack was in Paul's machine shop. It smelled of cutting oil and hot steel, and it was louder than anywhere Jack had been since the activation. Paul's crew had dragged a stack of gutter sections off a rack, long and gleaming, and laid them end to end on two workbenches.</w:t>
+      </w:r>
+    </w:p>
+    <w:p>
+      <w:r>
+        <w:t>Paul pointed at one end with a rivet gun. "Hold that. Your good hand. I'm not having Mercer come after me."</w:t>
+      </w:r>
+    </w:p>
+    <w:p>
+      <w:r>
+        <w:t>Jack held it. Paul set a rivet, and the gun bucked with a sharp crack.</w:t>
+      </w:r>
+    </w:p>
+    <w:p>
+      <w:r>
+        <w:t>"Ten meters, end to end. Feet underneath, so it stands on the asphalt without rocking."</w:t>
+      </w:r>
+    </w:p>
+    <w:p>
+      <w:r>
+        <w:t>Jack looked down the length of it. The gutter was the width of his hand and a half, maybe less.</w:t>
+      </w:r>
+    </w:p>
+    <w:p>
+      <w:r>
+        <w:t>"Paul. That drop this morning hung as tall as my chest. When it fell, it was as wide as this bench."</w:t>
+      </w:r>
+    </w:p>
+    <w:p>
+      <w:r>
+        <w:t>Paul stopped. He lowered the rivet gun and looked at the gutter, and then at the bench, and then at the gutter again.</w:t>
+      </w:r>
+    </w:p>
+    <w:p>
+      <w:r>
+        <w:t>"So this catches about one handful of it, and the rest goes over the side like it did over the kid."</w:t>
+      </w:r>
+    </w:p>
+    <w:p>
+      <w:r>
+        <w:t>Paul swore, quietly and at length. Then he put the gun down, walked to the back wall, and dragged out a stack of corrugated roofing sheets.</w:t>
+      </w:r>
+    </w:p>
+    <w:p>
+      <w:r>
+        <w:t>"Then it's not a gutter. It's a box. Wide, and deep enough to hold what lands in it. Tall board up the back, on the grass side, so the water hits it and runs down instead of jumping out. And a lid. If it's going to sit out there full of water, I don't want anything climbing in."</w:t>
+      </w:r>
+    </w:p>
+    <w:p>
+      <w:r>
+        <w:t>"You're building it before Mark's signed off."</w:t>
+      </w:r>
+    </w:p>
+    <w:p>
+      <w:r>
+        <w:t>Paul lifted the first sheet onto the bench and reached for his snips.</w:t>
+      </w:r>
+    </w:p>
+    <w:p>
+      <w:r>
+        <w:t>"Building it isn't using it. When he signs off, it'll be ready. If he doesn't, I've got a very big box."</w:t>
+      </w:r>
+    </w:p>
+    <w:p>
+      <w:r>
+        <w:t>Doctor Mercer came to the house at eight exactly, as she had said. Sarah's pressure was the same as the night before, high and no worse, with no protein on the strip. Mercer looked at the notebook on Sarah's knee, full of times and arrows in Sarah's small, fast handwriting, and asked whether that was watching. Sarah said it was. Mercer pronounced Jack's hand no worse, and left.</w:t>
+      </w:r>
+    </w:p>
+    <w:p>
+      <w:r>
+        <w:t>Afterward, Sarah fell asleep against him on the couch with the notebook face down on her stomach. Jack laid his good hand flat beside it. After a while, something pushed back against his palm, slow and sleepy.</w:t>
+      </w:r>
+    </w:p>
+    <w:p>
+      <w:r>
+        <w:t>He bent his head close. "I heard you this morning. I said I'd tell you myself."</w:t>
+      </w:r>
+    </w:p>
+    <w:p>
+      <w:r>
+        <w:t>It was nearly midnight when Jack's wrist buzzed. He answered it as quietly as he could.</w:t>
+      </w:r>
+    </w:p>
+    <w:p>
+      <w:r>
+        <w:t>"Aiden. You're supposed to be asleep."</w:t>
+      </w:r>
+    </w:p>
+    <w:p>
+      <w:r>
+        <w:t>Aiden's voice was low and excited. "I was. I came back to check the long test. Doctor Bennett, there's a thermometer screwed to the frame of the greenhouse door. An old dial one. We read it every morning, for the seedlings. Yesterday morning it said six. I just went out and looked."</w:t>
+      </w:r>
+    </w:p>
+    <w:p>
+      <w:r>
+        <w:t>"And?"</w:t>
+      </w:r>
+    </w:p>
+    <w:p>
+      <w:r>
+        <w:t>"Eleven. At midnight. It's barely moving."</w:t>
+      </w:r>
+    </w:p>
+    <w:p>
+      <w:r>
+        <w:t>Jack looked at the window. Past the rooftops, where the stars had been the night before, there was nothing at all. Just a dark, flat sky, close and heavy.</w:t>
+      </w:r>
+    </w:p>
+    <w:p>
+      <w:r>
+        <w:t>"Clouds."</w:t>
+      </w:r>
+    </w:p>
+    <w:p>
+      <w:r>
+        <w:t>"Clouds. All the way across. I don't think there's going to be a sun tomorrow. Not the way there was."</w:t>
+      </w:r>
+    </w:p>
+    <w:p>
+      <w:r>
+        <w:t>Jack looked down at the notebook on Sarah's stomach, at every line of it written around the moment the sun hit the grass.</w:t>
+      </w:r>
+    </w:p>
+    <w:p>
+      <w:r>
+        <w:t>"Then we'll find out what it does without one."</w:t>
       </w:r>
     </w:p>
     <w:sectPr>

</xml_diff>

<commit_message>
Chapters 21-23: say "degrees Celsius"; translate into five languages
At Joshua's request, 2026-10-27. Pending Chapters 21-23 name the unit at
the first temperature reading in each chapter; manifests re-parsed, Mark's
go-rules line re-pinned, validation READY. Chapters 21-23 translated by
hand into id, pt-BR, es, fil and fr (306 lines per language, every line
covered); glossary rows appended, none changed. 19-21 and 22-24 Word
files rebuilt. No approval state changed; no audio generated.

Co-Authored-By: Claude Opus 5.5 <noreply@anthropic.com>
Claude-Session: https://claude.ai/code/session_0131aNiZD9M5bN9pqxT8JEFj
</commit_message>
<xml_diff>
--- a/manuscripts/19-21 Chapters - TRADDOMIUM Micro Battle.docx
+++ b/manuscripts/19-21 Chapters - TRADDOMIUM Micro Battle.docx
@@ -1286,7 +1286,7 @@
     </w:p>
     <w:p>
       <w:r>
-        <w:t>Aiden's voice was low and excited. "I was. I came back to check the long test. Doctor Bennett, there's a thermometer screwed to the frame of the greenhouse door. An old dial one. We read it every morning, for the seedlings. Yesterday morning it said six. I just went out and looked."</w:t>
+        <w:t>Aiden's voice was low and excited. "I was. I came back to check the long test. Doctor Bennett, there's a thermometer screwed to the frame of the greenhouse door. An old dial one. We read it every morning, for the seedlings. Yesterday morning it said six degrees Celsius. I just went out and looked."</w:t>
       </w:r>
     </w:p>
     <w:p>
@@ -1296,7 +1296,7 @@
     </w:p>
     <w:p>
       <w:r>
-        <w:t>"Eleven. At midnight. It's barely moving."</w:t>
+        <w:t>"Eleven degrees. At midnight. It's barely moving."</w:t>
       </w:r>
     </w:p>
     <w:p>

</xml_diff>